<commit_message>
Align Eureka materials with reviewer feedback
</commit_message>
<xml_diff>
--- a/DrillLoop_Idea_Document.docx
+++ b/DrillLoop_Idea_Document.docx
@@ -32,12 +32,12 @@
           <w:color w:val="6C808B"/>
           <w:sz w:val="34"/>
         </w:rPr>
-        <w:t>Turn exercise evidence into findings people can review and tasks teams can verify</w:t>
+        <w:t>Evidence-linked exercise reviews and action closure</w:t>
       </w:r>
     </w:p>
     <w:p>
       <w:r>
-        <w:t>A local-first review workspace for emergency preparedness teams, hospitals, airports, civil defense, training providers, and critical infrastructure operators.</w:t>
+        <w:t>A local-first review workspace for hospital preparedness evaluators. The proposed first use case is reviewing records from a hospital tabletop exercise; other sectors remain future candidates.</w:t>
       </w:r>
     </w:p>
     <w:tbl>
@@ -363,12 +363,12 @@
     </w:p>
     <w:p>
       <w:r>
-        <w:t>Emergency exercise evaluators turn notes, event logs, recordings, and observation forms into an After-Action Report and Improvement Plan (AAR/IP). Evidence is often scattered across files, timing conflicts need review, and improvement tasks can lose ownership or completion proof. DrillLoop keeps each proposed finding connected to its source record and leaves decisions with the human evaluator.</w:t>
+        <w:t>The proposed first use case is a hospital preparedness evaluator reviewing records from a tabletop exercise and preparing an After-Action Report and Improvement Plan (AAR/IP). Notes, event logs, transcripts, and timelines may need reconciliation; timing conflicts need review; and improvement tasks can lack an owner or completion proof. DrillLoop keeps proposed findings connected to source records and leaves decisions with a human evaluator.</w:t>
       </w:r>
     </w:p>
     <w:p>
       <w:r>
-        <w:t>The working MVP imports notes, CSV event logs, JSON transcripts, and PDFs with selectable text. It builds a timeline from recorded times, proposes a small set of findings for the fictional hospital exercise, supports evaluator approval or rejection, tracks owners and completion evidence, and exports an AAR/IP PDF.</w:t>
+        <w:t>The working MVP imports notes, CSV event logs, JSON transcripts, and PDFs with selectable text. It builds a timeline from recorded times, proposes findings for one fictional hospital power-outage fixture, supports evaluator approval or rejection, tracks owners and completion evidence, and exports an AAR/IP PDF. The rules have not been evaluated on an unfamiliar exercise.</w:t>
       </w:r>
     </w:p>
     <w:p>
@@ -381,12 +381,12 @@
         <w:pStyle w:val="Heading2"/>
       </w:pPr>
       <w:r>
-        <w:t>Problem and target user</w:t>
+        <w:t>First use case and roles to validate</w:t>
       </w:r>
     </w:p>
     <w:p>
       <w:r>
-        <w:t>The main user is an exercise lead or evaluator who must reconcile observations against pre-stated objectives and prepare a reviewer-ready report. Action owners need measurable tasks; senior preparedness reviewers need a defensible audit trail. Target customers include municipal emergency teams, hospitals, airports, civil defense, training providers, defense-support training organizations, and critical infrastructure operators.</w:t>
+        <w:t>Initial segment hypothesis: hospital preparedness teams reviewing tabletop exercises. The likely report preparer is an exercise evaluator or preparedness staff member. A preparedness lead or exercise sponsor is a candidate approver; the budget owner and procurement path are unknown. Municipal emergency teams, airports, civil defense, training providers, defense-support organizations, and critical-infrastructure operators are possible later segments, not validated customers.</w:t>
       </w:r>
     </w:p>
     <w:p>
@@ -399,7 +399,7 @@
     </w:p>
     <w:p>
       <w:r>
-        <w:t>The value hypothesis is that preserving source-level traceability and keeping corrective actions tied to evidence and reviewer decisions can reduce evidence hunting and make follow-up more reliable. No human time-savings study or ROI claim has been measured. The pilot must show whether review workload, rework, and closure verification improve in a real evaluator's workflow.</w:t>
+        <w:t>The value hypothesis is that source-level traceability and reviewer-controlled actions can reduce evidence hunting and make follow-up easier to verify. No user interviews, reporting-time baseline, evaluator correction study, pilot interest, or time-savings result is recorded. These measures remain to be established with a pilot partner.</w:t>
       </w:r>
     </w:p>
     <w:p>
@@ -1267,7 +1267,7 @@
                 <w:color w:val="253E4D"/>
                 <w:sz w:val="16"/>
               </w:rPr>
-              <w:t>Flag discrepancy; do not replace the source value.</w:t>
+              <w:t>Show the discrepancy; retain the original source value.</w:t>
             </w:r>
           </w:p>
         </w:tc>
@@ -2142,7 +2142,7 @@
     </w:p>
     <w:p>
       <w:r>
-        <w:t>After-action report generation and follow-up tasks are already available in existing products. Veoci publicly describes timestamps, communication transcripts, reports, assigned tasks, and reminders. D4H serves emergency-response readiness and related team workflows. FEMA’s Homeland Security Exercise and Evaluation Program (HSEEP) provides exercise-planning and evaluation guidance. A report template alone is not a unique product claim.</w:t>
+        <w:t>After-action reports and corrective-action workflows are available in existing products. Veoci publicly describes after-action reporting and follow-up; D4H serves emergency-response readiness and related team workflows. FEMA’s Homeland Security Exercise and Evaluation Program (HSEEP) provides exercise-planning and evaluation guidance. A report template alone is not a unique product claim. No same-workflow comparison with Veoci or another alternative has been run.</w:t>
       </w:r>
     </w:p>
     <w:tbl>
@@ -2560,7 +2560,7 @@
         <w:spacing w:after="40"/>
       </w:pPr>
       <w:r>
-        <w:t>The demo uses one shared reviewer password. It is not a named-user login system and does not give different people different permissions.</w:t>
+        <w:t>The demo uses one shared reviewer password. It has no named-user login or role-specific permissions.</w:t>
       </w:r>
     </w:p>
     <w:p>
@@ -2569,7 +2569,7 @@
         <w:spacing w:after="40"/>
       </w:pPr>
       <w:r>
-        <w:t>Original files and extracted text are saved in the configured database. The demo does not provide encryption at rest, file scanning, data-retention controls, scanned-page reading, or a security review.</w:t>
+        <w:t>Original files and extracted text are saved in the configured database. The demo has no configured encryption at rest, file scanning, retention/deletion controls, tenant isolation, or security assessment.</w:t>
       </w:r>
     </w:p>
     <w:p>
@@ -2578,7 +2578,7 @@
         <w:spacing w:after="40"/>
       </w:pPr>
       <w:r>
-        <w:t>Do not upload real patient or operational data to the hackathon demo. Production needs approved hosting, encryption and key management, strict user/role controls, audit access, retention rules, dependency scanning, and threat modeling.</w:t>
+        <w:t>The packaged demo and benchmark use fictional records. The system has not been validated for protected patient or operational data. A deployment handling such records would require approved hosting, encryption and key management, role controls, access auditing, retention/deletion rules, dependency scanning, and threat modeling.</w:t>
       </w:r>
     </w:p>
     <w:p>
@@ -2587,7 +2587,7 @@
         <w:spacing w:after="40"/>
       </w:pPr>
       <w:r>
-        <w:t>No cloud model call is required. Optional Ollama must be installed locally; weights should be staged, versioned, license-checked, and egress-restricted before private deployment.</w:t>
+        <w:t>The default workflow makes no cloud model call. Optional faster-whisper runs with a locally staged model; optional Ollama is configured as a local/private service for action wording. Neither optional path was included in the benchmark.</w:t>
       </w:r>
     </w:p>
     <w:p>
@@ -3119,7 +3119,7 @@
     </w:p>
     <w:p>
       <w:r>
-        <w:t>Manual evaluator performance, report-preparation time, correction workload, ASR word error rate, local LLM quality, and monetary savings have not been measured. The results are not a field-accuracy claim.</w:t>
+        <w:t>Manual evaluator performance, report-preparation time, correction workload, performance on an unfamiliar exercise, ASR word error rate, local LLM quality, and monetary savings have not been measured. The results are a technical check of the synthetic fixture, not field-accuracy evidence.</w:t>
       </w:r>
     </w:p>
     <w:p>
@@ -3132,12 +3132,12 @@
     </w:p>
     <w:p>
       <w:r>
-        <w:t>Potential packaging to test: $1,500 per exercise for small users; $18,000 annual organization subscription including up to 12 exercises; $65,000/year private deployment; $6,000 custom template; and $1,500/day implementation or evaluator-support services. These are illustrative willingness-to-pay probes, not quoted market rates. Annual support, onboarding, security obligations, and procurement costs need validation.</w:t>
+        <w:t>The first commercial model proposed for discovery is a per-exercise pilot fee. No price, delivery cost, staffing plan, customer volume, or willingness-to-pay evidence is established. Annual subscriptions, private deployment, custom templates, and support services remain options to evaluate after user and buyer discovery.</w:t>
       </w:r>
     </w:p>
     <w:p>
       <w:r>
-        <w:t>A labor-only workload hypothesis assumes 20 documentation hours per exercise, 40% of those hours potentially reduced, 12 exercises per year, and $65 fully-loaded evaluator labor per hour. That yields 96 capacity hours or $6,240 of annual capacity value—below the example $18,000 subscription. Time saved does not equal cash savings; customers must validate both hours and other operational value.</w:t>
+        <w:t>Time saved and monetary value are unknown. A future business case would need a customer-measured preparation-time baseline, verified change in staff effort, finance-approved labor costs, and evidence that capacity can be redeployed or cash costs reduced.</w:t>
       </w:r>
     </w:p>
     <w:p>
@@ -3178,7 +3178,7 @@
                 <w:color w:val="FFFFFF"/>
                 <w:sz w:val="16"/>
               </w:rPr>
-              <w:t>Horizon</w:t>
+              <w:t>Stage</w:t>
             </w:r>
           </w:p>
         </w:tc>
@@ -3246,7 +3246,7 @@
                 <w:color w:val="253E4D"/>
                 <w:sz w:val="16"/>
               </w:rPr>
-              <w:t>0–3 months</w:t>
+              <w:t>Discovery</w:t>
             </w:r>
           </w:p>
         </w:tc>
@@ -3268,7 +3268,7 @@
                 <w:color w:val="253E4D"/>
                 <w:sz w:val="16"/>
               </w:rPr>
-              <w:t>Pilot with 2–3 hospital/municipal exercise teams; measure evidence review and correction effort.</w:t>
+              <w:t>Interview 2–3 prospective hospital preparedness users and observe one current review process with permission.</w:t>
             </w:r>
           </w:p>
         </w:tc>
@@ -3290,7 +3290,7 @@
                 <w:color w:val="253E4D"/>
                 <w:sz w:val="16"/>
               </w:rPr>
-              <w:t>Evaluator agreement, citation accuracy, privacy approval, and time logging.</w:t>
+              <w:t>Role map, baseline measures, data permissions, and a willing pilot contact.</w:t>
             </w:r>
           </w:p>
         </w:tc>
@@ -3314,7 +3314,7 @@
                 <w:color w:val="253E4D"/>
                 <w:sz w:val="16"/>
               </w:rPr>
-              <w:t>3–6 months</w:t>
+              <w:t>Paired pilot</w:t>
             </w:r>
           </w:p>
         </w:tc>
@@ -3336,7 +3336,7 @@
                 <w:color w:val="253E4D"/>
                 <w:sz w:val="16"/>
               </w:rPr>
-              <w:t>Role-based authentication, configurable templates, action-owner workflow, export tuning.</w:t>
+              <w:t>Compare the current process with DrillLoop on the same permitted exercise records; include a tabletop exercise and uncertainty cases.</w:t>
             </w:r>
           </w:p>
         </w:tc>
@@ -3358,7 +3358,7 @@
                 <w:color w:val="253E4D"/>
                 <w:sz w:val="16"/>
               </w:rPr>
-              <w:t>Customer fit, procurement requirements, independent report review.</w:t>
+              <w:t>Partner-defined thresholds for preparation time, reviewer corrections, citations, and action completeness.</w:t>
             </w:r>
           </w:p>
         </w:tc>
@@ -3382,7 +3382,7 @@
                 <w:color w:val="253E4D"/>
                 <w:sz w:val="16"/>
               </w:rPr>
-              <w:t>6–12 months</w:t>
+              <w:t>Generalization and deployment review</w:t>
             </w:r>
           </w:p>
         </w:tc>
@@ -3404,7 +3404,7 @@
                 <w:color w:val="253E4D"/>
                 <w:sz w:val="16"/>
               </w:rPr>
-              <w:t>Evaluate integrations, long-term trend views, and optional retrieval/model support.</w:t>
+              <w:t>Evaluate evaluator-labeled evidence from an unfamiliar exercise; compare missed/incorrect findings and review effort. Review data flow and access controls.</w:t>
             </w:r>
           </w:p>
         </w:tc>
@@ -3426,7 +3426,7 @@
                 <w:color w:val="253E4D"/>
                 <w:sz w:val="16"/>
               </w:rPr>
-              <w:t>Measured citation benefit, consented data, model license and bias review.</w:t>
+              <w:t>Independent labels, false-positive/missed-finding results, security and retention requirements.</w:t>
             </w:r>
           </w:p>
         </w:tc>
@@ -3436,6 +3436,11 @@
       <w:pPr>
         <w:spacing w:after="20"/>
       </w:pPr>
+    </w:p>
+    <w:p>
+      <w:r>
+        <w:t>The Eureka form identifies the lead function as Product–Synergy / AI Engineering. Specific delivery allocation, emergency-preparedness experience, and an adviser or pilot partner are not documented. The proposed stages have no confirmed schedule or staffing commitment.</w:t>
+      </w:r>
     </w:p>
     <w:p>
       <w:pPr>
@@ -3465,7 +3470,7 @@
     </w:p>
     <w:p>
       <w:r>
-        <w:t>The public references below informed workflow and positioning. Accessed or version-checked 26 October 2026. Competitor features are summarized from public product materials, not a scored product teardown.</w:t>
+        <w:t>The public references below informed workflow and positioning. Accessed or version-checked 26 October 2026. Competitor features are summarized from public product materials, not a scored product teardown. A potential fit with Presight public-safety work is a hypothesis; no integration or customer demand is established.</w:t>
       </w:r>
     </w:p>
     <w:p>

</xml_diff>